<commit_message>
feat: complete shipment invoice and notification flows
</commit_message>
<xml_diff>
--- a/docs/Freight_Customer_Portal_PRD_V1.0_CN.docx
+++ b/docs/Freight_Customer_Portal_PRD_V1.0_CN.docx
@@ -7,6 +7,9 @@
         <w:jc w:val="center"/>
       </w:pPr>
       <w:r>
+        <w:rPr>
+          <w:rFonts/>
+        </w:rPr>
         <w:br/>
         <w:br/>
       </w:r>
@@ -40,6 +43,9 @@
     </w:p>
     <w:p>
       <w:r>
+        <w:rPr>
+          <w:rFonts/>
+        </w:rPr>
         <w:br/>
       </w:r>
     </w:p>
@@ -80,11 +86,9 @@
           <w:p>
             <w:r>
               <w:rPr>
-                <w:rFonts w:ascii="Noto Sans CJK SC" w:hAnsi="Noto Sans CJK SC" w:eastAsia="Noto Sans CJK SC"/>
-                <w:b w:val="0"/>
-                <w:sz w:val="20"/>
-              </w:rPr>
-              <w:t>V1.0</w:t>
+                <w:rFonts w:eastAsia="Noto Sans CJK SC"/>
+              </w:rPr>
+              <w:t>V1.0.1</w:t>
             </w:r>
           </w:p>
         </w:tc>
@@ -185,11 +189,9 @@
           <w:p>
             <w:r>
               <w:rPr>
-                <w:rFonts w:ascii="Noto Sans CJK SC" w:hAnsi="Noto Sans CJK SC" w:eastAsia="Noto Sans CJK SC"/>
-                <w:b w:val="0"/>
-                <w:sz w:val="20"/>
-              </w:rPr>
-              <w:t>2026-08-27</w:t>
+                <w:rFonts w:eastAsia="Noto Sans CJK SC"/>
+              </w:rPr>
+              <w:t>2026-08-30</w:t>
             </w:r>
           </w:p>
         </w:tc>
@@ -197,6 +199,9 @@
     </w:tbl>
     <w:p>
       <w:r>
+        <w:rPr>
+          <w:rFonts/>
+        </w:rPr>
         <w:br/>
       </w:r>
     </w:p>
@@ -215,6 +220,9 @@
     </w:p>
     <w:p>
       <w:r>
+        <w:rPr>
+          <w:rFonts/>
+        </w:rPr>
         <w:br w:type="page"/>
       </w:r>
     </w:p>
@@ -223,6 +231,9 @@
         <w:pStyle w:val="Heading1"/>
       </w:pPr>
       <w:r>
+        <w:rPr>
+          <w:rFonts/>
+        </w:rPr>
         <w:t>文档控制</w:t>
       </w:r>
     </w:p>
@@ -367,6 +378,64 @@
           </w:p>
         </w:tc>
       </w:tr>
+      <w:tr>
+        <w:tc>
+          <w:tcPr>
+            <w:tcW w:type="dxa" w:w="2520"/>
+          </w:tcPr>
+          <w:p>
+            <w:pPr/>
+            <w:r>
+              <w:rPr>
+                <w:rFonts w:eastAsia="PingFang SC"/>
+              </w:rPr>
+              <w:t>V1.0.1</w:t>
+            </w:r>
+          </w:p>
+        </w:tc>
+        <w:tc>
+          <w:tcPr>
+            <w:tcW w:type="dxa" w:w="2520"/>
+          </w:tcPr>
+          <w:p>
+            <w:pPr/>
+            <w:r>
+              <w:rPr>
+                <w:rFonts w:eastAsia="PingFang SC"/>
+              </w:rPr>
+              <w:t>2026-08-30</w:t>
+            </w:r>
+          </w:p>
+        </w:tc>
+        <w:tc>
+          <w:tcPr>
+            <w:tcW w:type="dxa" w:w="2520"/>
+          </w:tcPr>
+          <w:p>
+            <w:pPr/>
+            <w:r>
+              <w:rPr>
+                <w:rFonts w:eastAsia="PingFang SC"/>
+              </w:rPr>
+              <w:t>产品负责人</w:t>
+            </w:r>
+          </w:p>
+        </w:tc>
+        <w:tc>
+          <w:tcPr>
+            <w:tcW w:type="dxa" w:w="2520"/>
+          </w:tcPr>
+          <w:p>
+            <w:pPr/>
+            <w:r>
+              <w:rPr>
+                <w:rFonts w:eastAsia="PingFang SC"/>
+              </w:rPr>
+              <w:t>澄清客户报价申请流程：确认箱型/箱量、按计价单位计算、销售确认后发送正式报价</w:t>
+            </w:r>
+          </w:p>
+        </w:tc>
+      </w:tr>
     </w:tbl>
     <w:tbl>
       <w:tblPr>
@@ -419,6 +488,9 @@
         <w:pStyle w:val="Heading1"/>
       </w:pPr>
       <w:r>
+        <w:rPr>
+          <w:rFonts/>
+        </w:rPr>
         <w:t>目录</w:t>
       </w:r>
     </w:p>
@@ -659,6 +731,9 @@
     </w:p>
     <w:p>
       <w:r>
+        <w:rPr>
+          <w:rFonts/>
+        </w:rPr>
         <w:br w:type="page"/>
       </w:r>
     </w:p>
@@ -667,6 +742,9 @@
         <w:pStyle w:val="Heading1"/>
       </w:pPr>
       <w:r>
+        <w:rPr>
+          <w:rFonts/>
+        </w:rPr>
         <w:t>1. 项目背景与目标</w:t>
       </w:r>
     </w:p>
@@ -675,11 +753,17 @@
         <w:pStyle w:val="Heading2"/>
       </w:pPr>
       <w:r>
+        <w:rPr>
+          <w:rFonts/>
+        </w:rPr>
         <w:t>1.1 背景</w:t>
       </w:r>
     </w:p>
     <w:p>
       <w:r>
+        <w:rPr>
+          <w:rFonts/>
+        </w:rPr>
         <w:t>大量中小国际货代公司的客户服务仍依赖微信、邮件和 Excel：客户找销售询价、发送托书、追问订舱与开船节点、索要 SO/BL/账单，内部人员重复传递信息。V1 的目标不是替代完整货代 ERP，而是在客户侧建立一个可独立品牌化、可多租户交付的在线门户。</w:t>
       </w:r>
     </w:p>
@@ -688,6 +772,9 @@
         <w:pStyle w:val="Heading2"/>
       </w:pPr>
       <w:r>
+        <w:rPr>
+          <w:rFonts/>
+        </w:rPr>
         <w:t>1.2 产品目标</w:t>
       </w:r>
     </w:p>
@@ -744,6 +831,9 @@
         <w:pStyle w:val="Heading2"/>
       </w:pPr>
       <w:r>
+        <w:rPr>
+          <w:rFonts/>
+        </w:rPr>
         <w:t>1.3 商业验证目标</w:t>
       </w:r>
     </w:p>
@@ -1126,6 +1216,9 @@
         <w:pStyle w:val="Heading1"/>
       </w:pPr>
       <w:r>
+        <w:rPr>
+          <w:rFonts/>
+        </w:rPr>
         <w:t>2. 产品定位与范围</w:t>
       </w:r>
     </w:p>
@@ -1134,6 +1227,9 @@
         <w:pStyle w:val="Heading2"/>
       </w:pPr>
       <w:r>
+        <w:rPr>
+          <w:rFonts/>
+        </w:rPr>
         <w:t>2.1 产品定位</w:t>
       </w:r>
     </w:p>
@@ -1188,6 +1284,9 @@
         <w:pStyle w:val="Heading2"/>
       </w:pPr>
       <w:r>
+        <w:rPr>
+          <w:rFonts/>
+        </w:rPr>
         <w:t>2.2 V1 必做范围</w:t>
       </w:r>
     </w:p>
@@ -1601,6 +1700,9 @@
         <w:pStyle w:val="Heading2"/>
       </w:pPr>
       <w:r>
+        <w:rPr>
+          <w:rFonts/>
+        </w:rPr>
         <w:t>2.3 V1 明确不做</w:t>
       </w:r>
     </w:p>
@@ -1681,6 +1783,9 @@
         <w:pStyle w:val="Heading1"/>
       </w:pPr>
       <w:r>
+        <w:rPr>
+          <w:rFonts/>
+        </w:rPr>
         <w:t>3. 用户与角色</w:t>
       </w:r>
     </w:p>
@@ -2159,6 +2264,9 @@
         <w:pStyle w:val="Heading1"/>
       </w:pPr>
       <w:r>
+        <w:rPr>
+          <w:rFonts/>
+        </w:rPr>
         <w:t>4. 核心业务流程</w:t>
       </w:r>
     </w:p>
@@ -2167,6 +2275,9 @@
         <w:pStyle w:val="Heading2"/>
       </w:pPr>
       <w:r>
+        <w:rPr>
+          <w:rFonts/>
+        </w:rPr>
         <w:t>4.1 主闭环</w:t>
       </w:r>
     </w:p>
@@ -2271,6 +2382,9 @@
         <w:pStyle w:val="Heading2"/>
       </w:pPr>
       <w:r>
+        <w:rPr>
+          <w:rFonts/>
+        </w:rPr>
         <w:t>4.2 查价与报价</w:t>
       </w:r>
     </w:p>
@@ -2307,7 +2421,7 @@
           <w:rFonts w:ascii="Noto Sans CJK SC" w:hAnsi="Noto Sans CJK SC" w:eastAsia="Noto Sans CJK SC"/>
           <w:sz w:val="21"/>
         </w:rPr>
-        <w:t>客户查看结果并选择一个方案生成 Quote。</w:t>
+        <w:t>客户查看结果并选择一个方案，点击“申请报价”后在确认页核对航线、船司、ETD、箱型、箱量、费用明细、预估总额和有效期，再提交报价申请。</w:t>
       </w:r>
     </w:p>
     <w:p>
@@ -2319,7 +2433,7 @@
           <w:rFonts w:ascii="Noto Sans CJK SC" w:hAnsi="Noto Sans CJK SC" w:eastAsia="Noto Sans CJK SC"/>
           <w:sz w:val="21"/>
         </w:rPr>
-        <w:t>Quote 记录原始成本、销售价、有效期、销售负责人和状态。</w:t>
+        <w:t>系统按箱量计算海运费和按箱附加费，按票/按 Shipment 的费用只计算一次；QuoteItem 保存数量、单价、金额及成本/销售价快照。</w:t>
       </w:r>
     </w:p>
     <w:p>
@@ -2331,7 +2445,7 @@
           <w:rFonts w:ascii="Noto Sans CJK SC" w:hAnsi="Noto Sans CJK SC" w:eastAsia="Noto Sans CJK SC"/>
           <w:sz w:val="21"/>
         </w:rPr>
-        <w:t>客户可在线查看、下载 PDF、接受或拒绝；接受后可一键创建 Booking。</w:t>
+        <w:t>提交后生成 Draft，客户侧显示“待销售确认”；销售审核或手工调价并发送后，客户才可下载正式 PDF、接受或拒绝；接受后可一键创建 Booking。</w:t>
       </w:r>
     </w:p>
     <w:p>
@@ -2339,6 +2453,9 @@
         <w:pStyle w:val="Heading2"/>
       </w:pPr>
       <w:r>
+        <w:rPr>
+          <w:rFonts/>
+        </w:rPr>
         <w:t>4.3 Booking 与 Shipment</w:t>
       </w:r>
     </w:p>
@@ -2419,6 +2536,9 @@
         <w:pStyle w:val="Heading1"/>
       </w:pPr>
       <w:r>
+        <w:rPr>
+          <w:rFonts/>
+        </w:rPr>
         <w:t>5. 功能需求</w:t>
       </w:r>
     </w:p>
@@ -2427,6 +2547,9 @@
         <w:pStyle w:val="Heading2"/>
       </w:pPr>
       <w:r>
+        <w:rPr>
+          <w:rFonts/>
+        </w:rPr>
         <w:t>5.1 客户门户</w:t>
       </w:r>
     </w:p>
@@ -3009,6 +3132,9 @@
         <w:pStyle w:val="Heading2"/>
       </w:pPr>
       <w:r>
+        <w:rPr>
+          <w:rFonts/>
+        </w:rPr>
         <w:t>5.2 内部运营后台</w:t>
       </w:r>
     </w:p>
@@ -3691,6 +3817,9 @@
         <w:pStyle w:val="Heading2"/>
       </w:pPr>
       <w:r>
+        <w:rPr>
+          <w:rFonts/>
+        </w:rPr>
         <w:t>5.3 SaaS 平台管理</w:t>
       </w:r>
     </w:p>
@@ -3747,6 +3876,9 @@
         <w:pStyle w:val="Heading1"/>
       </w:pPr>
       <w:r>
+        <w:rPr>
+          <w:rFonts/>
+        </w:rPr>
         <w:t>6. 核心业务对象与状态</w:t>
       </w:r>
     </w:p>
@@ -4029,6 +4161,9 @@
         <w:pStyle w:val="Heading2"/>
       </w:pPr>
       <w:r>
+        <w:rPr>
+          <w:rFonts/>
+        </w:rPr>
         <w:t>6.1 标准 Tracking Event</w:t>
       </w:r>
     </w:p>
@@ -4227,6 +4362,9 @@
         <w:pStyle w:val="Heading1"/>
       </w:pPr>
       <w:r>
+        <w:rPr>
+          <w:rFonts/>
+        </w:rPr>
         <w:t>7. 权限与数据可见性</w:t>
       </w:r>
     </w:p>
@@ -4307,6 +4445,9 @@
         <w:pStyle w:val="Heading1"/>
       </w:pPr>
       <w:r>
+        <w:rPr>
+          <w:rFonts/>
+        </w:rPr>
         <w:t>8. 非功能需求</w:t>
       </w:r>
     </w:p>
@@ -4615,6 +4756,9 @@
         <w:pStyle w:val="Heading1"/>
       </w:pPr>
       <w:r>
+        <w:rPr>
+          <w:rFonts/>
+        </w:rPr>
         <w:t>9. 数据指标与埋点</w:t>
       </w:r>
     </w:p>
@@ -5047,11 +5191,17 @@
         <w:pStyle w:val="Heading1"/>
       </w:pPr>
       <w:r>
+        <w:rPr>
+          <w:rFonts/>
+        </w:rPr>
         <w:t>10. V1 验收标准</w:t>
       </w:r>
     </w:p>
     <w:p>
       <w:r>
+        <w:rPr>
+          <w:rFonts/>
+        </w:rPr>
         <w:t>只有在不需要开发人员直接修改数据库的情况下，以下完整流程可由业务人员与客户独立完成，才视为 V1 功能验收通过：</w:t>
       </w:r>
     </w:p>
@@ -5324,6 +5474,9 @@
         <w:pStyle w:val="Heading1"/>
       </w:pPr>
       <w:r>
+        <w:rPr>
+          <w:rFonts/>
+        </w:rPr>
         <w:t>11. 路线图与里程碑</w:t>
       </w:r>
     </w:p>
@@ -6004,6 +6157,9 @@
         <w:pStyle w:val="Heading1"/>
       </w:pPr>
       <w:r>
+        <w:rPr>
+          <w:rFonts/>
+        </w:rPr>
         <w:t>12. 风险与范围管理</w:t>
       </w:r>
     </w:p>
@@ -6336,6 +6492,9 @@
         <w:pStyle w:val="Heading1"/>
       </w:pPr>
       <w:r>
+        <w:rPr>
+          <w:rFonts/>
+        </w:rPr>
         <w:t>附录 A. 字段基线</w:t>
       </w:r>
     </w:p>
@@ -6679,6 +6838,9 @@
         <w:pStyle w:val="Heading1"/>
       </w:pPr>
       <w:r>
+        <w:rPr>
+          <w:rFonts/>
+        </w:rPr>
         <w:t>附录 B. UAT 核心用例</w:t>
       </w:r>
     </w:p>

</xml_diff>